<commit_message>
feat(p4): rebuild CT-1/FITO/customs request letters to match Excel sheets
The generated letters were one-sentence stubs; the letter CT1 / fito / customs
office sheets carry more. Rebuilt in build_templates.py (three dedicated
builders, Times New Roman, A4) with the context builders extended:

- CT-1: sender + consignee blocks (Отправитель / Грузополучатель) and the
  Нетто / Брутто / Кол-во мест weights.
- FITO: the truck line (1 автомашина: {plate}) + sender/consignee blocks.
- Customs (ARZA, Turkmen): truck table (T/b · plate · product · boxes · gross)
  + the full four-paragraph legal boilerplate, with generate-time place_loading
  inserted, plus the Telekeçi signature.

New shared _letter_figures(invoice) supplies per-firm net/gross/boxes/plate
(same rule as the invoice line). Renders verified against all three sheets;
letter test strengthened to assert the parties/weights/table content.
57 doc-gen tests green.

Co-Authored-By: Claude Opus 4.8 (1M context) <noreply@anthropic.com>
</commit_message>
<xml_diff>
--- a/backend/apps/contracts/document_templates/ct1_ru.docx
+++ b/backend/apps/contracts/document_templates/ct1_ru.docx
@@ -4,26 +4,38 @@
   <w:body>
     <w:p>
       <w:pPr>
-        <w:jc w:val="right"/>
+        <w:ind w:left="3969"/>
+        <w:jc w:val="center"/>
       </w:pPr>
       <w:r>
+        <w:rPr>
+          <w:b/>
+        </w:rPr>
         <w:t>Директору предприятия</w:t>
       </w:r>
     </w:p>
     <w:p>
       <w:pPr>
-        <w:jc w:val="right"/>
+        <w:ind w:left="3969"/>
+        <w:jc w:val="center"/>
       </w:pPr>
       <w:r>
-        <w:t>«Туркменэкспертиза» ТПП</w:t>
+        <w:rPr>
+          <w:b/>
+        </w:rPr>
+        <w:t>«Туркменэкспертиза» ТПП в</w:t>
       </w:r>
     </w:p>
     <w:p>
       <w:pPr>
-        <w:jc w:val="right"/>
+        <w:ind w:left="3969"/>
+        <w:jc w:val="center"/>
       </w:pPr>
       <w:r>
-        <w:t>в Туркменистане</w:t>
+        <w:rPr>
+          <w:b/>
+        </w:rPr>
+        <w:t>Туркменистане</w:t>
       </w:r>
     </w:p>
     <w:p/>
@@ -32,23 +44,177 @@
         <w:jc w:val="both"/>
       </w:pPr>
       <w:r>
+        <w:rPr>
+          <w:b w:val="0"/>
+          <w:sz w:val="24"/>
+        </w:rPr>
         <w:t>{{ firm_name }} просит Вас оформить сертификат происхождения формы «СТ-1», на {{ product }}. Контракт № {{ contract_line }}.</w:t>
+      </w:r>
+    </w:p>
+    <w:p>
+      <w:r>
+        <w:rPr>
+          <w:b w:val="0"/>
+          <w:sz w:val="24"/>
+        </w:rPr>
+        <w:t>Отправитель: {{ firm_name }}</w:t>
+      </w:r>
+    </w:p>
+    <w:p>
+      <w:r>
+        <w:rPr>
+          <w:b w:val="0"/>
+          <w:sz w:val="24"/>
+        </w:rPr>
+        <w:t>{{ firm_address }}</w:t>
       </w:r>
     </w:p>
     <w:p/>
     <w:p>
       <w:r>
-        <w:t>{{ doc_date }}</w:t>
+        <w:rPr>
+          <w:b w:val="0"/>
+          <w:sz w:val="24"/>
+        </w:rPr>
+        <w:t>Грузополучатель: {{ buyer_name }}</w:t>
       </w:r>
     </w:p>
     <w:p>
       <w:r>
-        <w:t>Директор ___________________ {{ firm_name }}</w:t>
+        <w:rPr>
+          <w:b w:val="0"/>
+          <w:sz w:val="18"/>
+        </w:rPr>
+        <w:t>{{ buyer_address }}</w:t>
+      </w:r>
+    </w:p>
+    <w:p/>
+    <w:tbl>
+      <w:tblPr>
+        <w:tblW w:type="auto" w:w="0"/>
+        <w:tblLayout w:type="fixed"/>
+        <w:tblLook w:firstColumn="1" w:firstRow="1" w:lastColumn="0" w:lastRow="0" w:noHBand="0" w:noVBand="1" w:val="04A0"/>
+      </w:tblPr>
+      <w:tblGrid>
+        <w:gridCol w:w="4961"/>
+        <w:gridCol w:w="4961"/>
+      </w:tblGrid>
+      <w:tr>
+        <w:tc>
+          <w:tcPr>
+            <w:tcW w:type="dxa" w:w="1984"/>
+          </w:tcPr>
+          <w:p>
+            <w:r/>
+            <w:r>
+              <w:rPr>
+                <w:b w:val="0"/>
+                <w:i w:val="0"/>
+                <w:sz w:val="24"/>
+              </w:rPr>
+              <w:t>Нетто:</w:t>
+            </w:r>
+          </w:p>
+        </w:tc>
+        <w:tc>
+          <w:tcPr>
+            <w:tcW w:type="dxa" w:w="3402"/>
+          </w:tcPr>
+          <w:p>
+            <w:r/>
+            <w:r>
+              <w:rPr>
+                <w:b w:val="0"/>
+                <w:i w:val="0"/>
+                <w:sz w:val="24"/>
+              </w:rPr>
+              <w:t>{{ net }} кг.</w:t>
+            </w:r>
+          </w:p>
+        </w:tc>
+      </w:tr>
+      <w:tr>
+        <w:tc>
+          <w:tcPr>
+            <w:tcW w:type="dxa" w:w="1984"/>
+          </w:tcPr>
+          <w:p>
+            <w:r/>
+            <w:r>
+              <w:rPr>
+                <w:b w:val="0"/>
+                <w:i w:val="0"/>
+                <w:sz w:val="24"/>
+              </w:rPr>
+              <w:t>Брутто:</w:t>
+            </w:r>
+          </w:p>
+        </w:tc>
+        <w:tc>
+          <w:tcPr>
+            <w:tcW w:type="dxa" w:w="3402"/>
+          </w:tcPr>
+          <w:p>
+            <w:r/>
+            <w:r>
+              <w:rPr>
+                <w:b w:val="0"/>
+                <w:i w:val="0"/>
+                <w:sz w:val="24"/>
+              </w:rPr>
+              <w:t>{{ gross }} кг.</w:t>
+            </w:r>
+          </w:p>
+        </w:tc>
+      </w:tr>
+      <w:tr>
+        <w:tc>
+          <w:tcPr>
+            <w:tcW w:type="dxa" w:w="1984"/>
+          </w:tcPr>
+          <w:p>
+            <w:r/>
+            <w:r>
+              <w:rPr>
+                <w:b w:val="0"/>
+                <w:i w:val="0"/>
+                <w:sz w:val="24"/>
+              </w:rPr>
+              <w:t>Кол-во мест:</w:t>
+            </w:r>
+          </w:p>
+        </w:tc>
+        <w:tc>
+          <w:tcPr>
+            <w:tcW w:type="dxa" w:w="3402"/>
+          </w:tcPr>
+          <w:p>
+            <w:r/>
+            <w:r>
+              <w:rPr>
+                <w:b w:val="0"/>
+                <w:i w:val="0"/>
+                <w:sz w:val="24"/>
+              </w:rPr>
+              <w:t>{{ boxes }} шт.</w:t>
+            </w:r>
+          </w:p>
+        </w:tc>
+      </w:tr>
+    </w:tbl>
+    <w:p/>
+    <w:p>
+      <w:r>
+        <w:rPr>
+          <w:b/>
+          <w:sz w:val="24"/>
+        </w:rPr>
+        <w:t>{{ firm_name }}__________________________</w:t>
       </w:r>
     </w:p>
     <w:sectPr>
-      <w:pgSz w:w="12240" w:h="15840"/>
-      <w:pgMar w:top="1440" w:right="1800" w:bottom="1440" w:left="1800" w:header="720" w:footer="720" w:gutter="0"/>
+      <w:pgSz w:w="11906" w:h="16838"/>
+      <w:pgMar w:top="850" w:right="850" w:bottom="850" w:left="1134" w:header="720" w:footer="720" w:gutter="0"/>
       <w:cols w:space="720"/>
       <w:docGrid w:linePitch="360"/>
     </w:sectPr>
@@ -420,7 +586,8 @@
     <w:qFormat/>
     <w:rsid w:val="00FC693F"/>
     <w:rPr>
-      <w:sz w:val="22"/>
+      <w:rFonts w:ascii="Times New Roman" w:hAnsi="Times New Roman"/>
+      <w:sz w:val="24"/>
     </w:rPr>
   </w:style>
   <w:style w:type="paragraph" w:styleId="Header">

</xml_diff>